<commit_message>
WIP: Detection module refactor - Kraus operators need fixing
Current status:
- Detection scans all bins without early stopping (Method 1)
- Kraus operators built but NOT producing clicks (0 clicks with 2 photons)
- Root cause: Kraus operators not correctly absorbing photons to |vac>

Next steps:
- Rewrite build_detection_kraus_18d() per docs/14 bucket SNSPD model
- K_10/K_01 should map all photon states to |vac>, not preserve them
</commit_message>
<xml_diff>
--- a/thesis/thesis.docx
+++ b/thesis/thesis.docx
@@ -3561,14 +3561,14 @@
           <w:b/>
           <w:bCs/>
         </w:rPr>
-        <w:t xml:space="preserve">基于时间</w:t>
+        <w:t xml:space="preserve">基于time-bin–MPS</w:t>
       </w:r>
       <w:r>
         <w:rPr>
           <w:b/>
           <w:bCs/>
         </w:rPr>
-        <w:t xml:space="preserve"> bin–MPS </w:t>
+        <w:t xml:space="preserve"> </w:t>
       </w:r>
       <w:r>
         <w:rPr>

</xml_diff>